<commit_message>
chore: update Word and Excel showcase assets
- Replaced Word GIFs (word1.gif, word2.gif, word3.gif) with new materials
- Replaced Excel GIFs (excel1.gif, excel2.gif, excel3.gif) with new materials
- Updated source documents (academic-paper.docx, budget-tracker.xlsx, etc.)
- Removed temporary Excel lock files (.~*.xlsx)

Co-Authored-By: Claude Sonnet 4.5 <noreply@anthropic.com>
</commit_message>
<xml_diff>
--- a/assets/showcase/restaurant-menu.docx
+++ b/assets/showcase/restaurant-menu.docx
@@ -1,6 +1,6 @@
 
 <file path=word/document.xml><?xml version="1.0" encoding="utf-8"?>
-<w:document xmlns:w="http://schemas.openxmlformats.org/wordprocessingml/2006/main">
+<w:document xmlns:wpc="http://schemas.microsoft.com/office/word/2010/wordprocessingCanvas" xmlns:mc="http://schemas.openxmlformats.org/markup-compatibility/2006" xmlns:o="urn:schemas-microsoft-com:office:office" xmlns:r="http://schemas.openxmlformats.org/officeDocument/2006/relationships" xmlns:m="http://schemas.openxmlformats.org/officeDocument/2006/math" xmlns:v="urn:schemas-microsoft-com:vml" xmlns:wp14="http://schemas.microsoft.com/office/word/2010/wordprocessingDrawing" xmlns:wp="http://schemas.openxmlformats.org/drawingml/2006/wordprocessingDrawing" xmlns:w="http://schemas.openxmlformats.org/wordprocessingml/2006/main" xmlns:w14="http://schemas.microsoft.com/office/word/2010/wordml" xmlns:w10="urn:schemas-microsoft-com:office:word" xmlns:w15="http://schemas.microsoft.com/office/word/2012/wordml" xmlns:wpg="http://schemas.microsoft.com/office/word/2010/wordprocessingGroup" xmlns:wpi="http://schemas.microsoft.com/office/word/2010/wordprocessingInk" xmlns:wne="http://schemas.microsoft.com/office/word/2006/wordml" xmlns:wps="http://schemas.microsoft.com/office/word/2010/wordprocessingShape" xmlns:wpsCustomData="http://www.wps.cn/officeDocument/2013/wpsCustomData" mc:Ignorable="w14 w15 wp14">
   <w:body>
     <w:p>
       <w:pPr>
@@ -13,7 +13,7 @@
           <w:color w:val="1B4D3E"/>
           <w:sz w:val="64"/>
         </w:rPr>
-        <w:t xml:space="preserve">Jade Garden</w:t>
+        <w:t>Jade Garden</w:t>
       </w:r>
     </w:p>
     <w:p>
@@ -27,7 +27,7 @@
           <w:color w:val="C9A84C"/>
           <w:sz w:val="28"/>
         </w:rPr>
-        <w:t xml:space="preserve">JADE GARDEN</w:t>
+        <w:t>JADE GARDEN</w:t>
       </w:r>
     </w:p>
     <w:p>
@@ -41,7 +41,7 @@
           <w:color w:val="888888"/>
           <w:sz w:val="24"/>
         </w:rPr>
-        <w:t xml:space="preserve">Neo-Chinese Creative Cuisine · EST. 2020</w:t>
+        <w:t>Neo-Chinese Creative Cuisine · EST. 2020</w:t>
       </w:r>
     </w:p>
     <w:p>
@@ -68,7 +68,7 @@
           <w:color w:val="C9A84C"/>
           <w:sz w:val="20"/>
         </w:rPr>
-        <w:t xml:space="preserve">— SINCE 2020 —</w:t>
+        <w:t>— SINCE 2020 —</w:t>
       </w:r>
     </w:p>
     <w:p>
@@ -82,7 +82,7 @@
           <w:color w:val="888888"/>
           <w:sz w:val="20"/>
         </w:rPr>
-        <w:t xml:space="preserve">Bridging tradition and innovation, one dish at a time</w:t>
+        <w:t>Bridging tradition and innovation, one dish at a time</w:t>
       </w:r>
     </w:p>
     <w:p>
@@ -95,7 +95,7 @@
           <w:color w:val="888888"/>
           <w:sz w:val="16"/>
         </w:rPr>
-        <w:t xml:space="preserve">10% service charge applies · Prices inclusive of tax</w:t>
+        <w:t>10% service charge applies · Prices inclusive of tax</w:t>
       </w:r>
     </w:p>
     <w:p>
@@ -109,7 +109,7 @@
           <w:color w:val="C9A84C"/>
           <w:sz w:val="48"/>
         </w:rPr>
-        <w:t xml:space="preserve">STARTERS</w:t>
+        <w:t>STARTERS</w:t>
       </w:r>
     </w:p>
     <w:p>
@@ -122,7 +122,7 @@
           <w:color w:val="1B4D3E"/>
           <w:sz w:val="28"/>
         </w:rPr>
-        <w:t xml:space="preserve">Appetizers</w:t>
+        <w:t>Appetizers</w:t>
       </w:r>
     </w:p>
     <w:p>
@@ -150,7 +150,7 @@
           <w:color w:val="1B4D3E"/>
           <w:sz w:val="28"/>
         </w:rPr>
-        <w:t xml:space="preserve">Jade Shrimp Dumplings    $18</w:t>
+        <w:t>Jade Shrimp Dumplings    $18</w:t>
       </w:r>
     </w:p>
     <w:p>
@@ -163,7 +163,7 @@
           <w:color w:val="888888"/>
           <w:sz w:val="20"/>
         </w:rPr>
-        <w:t xml:space="preserve">Delicate shrimp wrapped in jade-green spinach skin, served with ginger-vinegar dipping sauce</w:t>
+        <w:t>Delicate shrimp wrapped in jade-green spinach skin, served with ginger-vinegar dipping sauce</w:t>
       </w:r>
     </w:p>
     <w:p>
@@ -177,7 +177,7 @@
           <w:color w:val="1B4D3E"/>
           <w:sz w:val="28"/>
         </w:rPr>
-        <w:t xml:space="preserve">Truffle Wild Mushroom Bisque    $26</w:t>
+        <w:t>Truffle Wild Mushroom Bisque    $26</w:t>
       </w:r>
     </w:p>
     <w:p>
@@ -190,7 +190,7 @@
           <w:color w:val="888888"/>
           <w:sz w:val="20"/>
         </w:rPr>
-        <w:t xml:space="preserve">Black truffle with seasonal wild mushrooms, slow-simmered to perfection</w:t>
+        <w:t>Black truffle with seasonal wild mushrooms, slow-simmered to perfection</w:t>
       </w:r>
     </w:p>
     <w:p>
@@ -204,7 +204,7 @@
           <w:color w:val="1B4D3E"/>
           <w:sz w:val="28"/>
         </w:rPr>
-        <w:t xml:space="preserve">Pan-Seared Foie Gras    $34</w:t>
+        <w:t>Pan-Seared Foie Gras    $34</w:t>
       </w:r>
     </w:p>
     <w:p>
@@ -217,47 +217,7 @@
           <w:color w:val="888888"/>
           <w:sz w:val="20"/>
         </w:rPr>
-        <w:t xml:space="preserve">French-style seared foie gras with caramelized apple and port wine reduction</w:t>
-      </w:r>
-    </w:p>
-    <w:p>
-      <w:pPr>
-        <w:spacing w:before="240" w:after="0"/>
-        <w:jc w:val="left"/>
-      </w:pPr>
-      <w:r>
-        <w:rPr>
-          <w:b/>
-          <w:color w:val="1B4D3E"/>
-          <w:sz w:val="28"/>
-        </w:rPr>
-        <w:t xml:space="preserve">Longjing Tea-Infused Tofu    $12</w:t>
-      </w:r>
-    </w:p>
-    <w:p>
-      <w:pPr>
-        <w:spacing w:before="40" w:after="200"/>
-      </w:pPr>
-      <w:r>
-        <w:rPr>
-          <w:i/>
-          <w:color w:val="888888"/>
-          <w:sz w:val="20"/>
-        </w:rPr>
-        <w:t xml:space="preserve">Artisan silken tofu infused with Longjing tea essence, garnished with pine nuts and goji berries</w:t>
-      </w:r>
-    </w:p>
-    <w:p>
-      <w:pPr>
-        <w:spacing w:before="1200" w:after="0"/>
-        <w:jc w:val="center"/>
-      </w:pPr>
-      <w:r>
-        <w:rPr>
-          <w:color w:val="888888"/>
-          <w:sz w:val="16"/>
-        </w:rPr>
-        <w:t xml:space="preserve">10% service charge applies · Prices inclusive of tax</w:t>
+        <w:t>French-style seared foie gras with caramelized apple and port wine reduction</w:t>
       </w:r>
     </w:p>
     <w:p>
@@ -272,7 +232,7 @@
           <w:color w:val="C9A84C"/>
           <w:sz w:val="48"/>
         </w:rPr>
-        <w:t xml:space="preserve">MAIN COURSES</w:t>
+        <w:t>MAIN COURSES</w:t>
       </w:r>
     </w:p>
     <w:p>
@@ -285,7 +245,7 @@
           <w:color w:val="1B4D3E"/>
           <w:sz w:val="28"/>
         </w:rPr>
-        <w:t xml:space="preserve">Main Courses</w:t>
+        <w:t>Main Courses</w:t>
       </w:r>
     </w:p>
     <w:p>
@@ -304,7 +264,6 @@
     </w:p>
     <w:p>
       <w:pPr>
-        <w:pStyle w:val="Heading2"/>
         <w:spacing w:before="240" w:after="160"/>
         <w:rPr>
           <w:sz w:val="32"/>
@@ -315,7 +274,7 @@
           <w:color w:val="1B4D3E"/>
           <w:sz w:val="32"/>
         </w:rPr>
-        <w:t xml:space="preserve">SEAFOOD</w:t>
+        <w:t>SEAFOOD</w:t>
       </w:r>
     </w:p>
     <w:p>
@@ -328,7 +287,7 @@
           <w:color w:val="1B4D3E"/>
           <w:sz w:val="28"/>
         </w:rPr>
-        <w:t xml:space="preserve">Steamed Coral Trout    $78</w:t>
+        <w:t>Steamed Coral Trout    $78</w:t>
       </w:r>
     </w:p>
     <w:p>
@@ -341,7 +300,7 @@
           <w:color w:val="888888"/>
           <w:sz w:val="20"/>
         </w:rPr>
-        <w:t xml:space="preserve">Live coral trout delicately steamed, finished with premium soy glaze to preserve its oceanic purity</w:t>
+        <w:t>Live coral trout delicately steamed, finished with premium soy glaze to preserve its oceanic purity</w:t>
       </w:r>
     </w:p>
     <w:p>
@@ -354,7 +313,7 @@
           <w:color w:val="1B4D3E"/>
           <w:sz w:val="28"/>
         </w:rPr>
-        <w:t xml:space="preserve">Wok-Fired Prawns in XO Sauce    $54</w:t>
+        <w:t>Wok-Fired Prawns in XO Sauce    $54</w:t>
       </w:r>
     </w:p>
     <w:p>
@@ -367,7 +326,7 @@
           <w:color w:val="888888"/>
           <w:sz w:val="20"/>
         </w:rPr>
-        <w:t xml:space="preserve">Live prawns seared with house-made XO sauce, capturing the breath of the wok</w:t>
+        <w:t>Live prawns seared with house-made XO sauce, capturing the breath of the wok</w:t>
       </w:r>
     </w:p>
     <w:p>
@@ -380,7 +339,7 @@
           <w:color w:val="1B4D3E"/>
           <w:sz w:val="28"/>
         </w:rPr>
-        <w:t xml:space="preserve">Crab Roe Lion Head Meatballs    $40</w:t>
+        <w:t>Crab Roe Lion Head Meatballs    $40</w:t>
       </w:r>
     </w:p>
     <w:p>
@@ -393,12 +352,11 @@
           <w:color w:val="888888"/>
           <w:sz w:val="20"/>
         </w:rPr>
-        <w:t xml:space="preserve">A Huaiyang classic of crab roe and pork, slow-braised in a clay pot</w:t>
-      </w:r>
-    </w:p>
-    <w:p>
-      <w:pPr>
-        <w:pStyle w:val="Heading2"/>
+        <w:t>A Huaiyang classic of crab roe and pork, slow-braised in a clay pot</w:t>
+      </w:r>
+    </w:p>
+    <w:p>
+      <w:pPr>
         <w:spacing w:before="360" w:after="160"/>
         <w:rPr>
           <w:sz w:val="32"/>
@@ -409,7 +367,7 @@
           <w:color w:val="1B4D3E"/>
           <w:sz w:val="32"/>
         </w:rPr>
-        <w:t xml:space="preserve">MEAT</w:t>
+        <w:t>MEAT</w:t>
       </w:r>
     </w:p>
     <w:p>
@@ -422,7 +380,7 @@
           <w:color w:val="1B4D3E"/>
           <w:sz w:val="28"/>
         </w:rPr>
-        <w:t xml:space="preserve">Wagyu Beef Cubes with Black Pepper Sauce    $92</w:t>
+        <w:t>Wagyu Beef Cubes with Black Pepper Sauce    $92</w:t>
       </w:r>
     </w:p>
     <w:p>
@@ -435,7 +393,7 @@
           <w:color w:val="888888"/>
           <w:sz w:val="20"/>
         </w:rPr>
-        <w:t xml:space="preserve">A5 Wagyu paired with freshly ground black pepper jus, best enjoyed at medium doneness</w:t>
+        <w:t>A5 Wagyu paired with freshly ground black pepper jus, best enjoyed at medium doneness</w:t>
       </w:r>
     </w:p>
     <w:p>
@@ -448,7 +406,7 @@
           <w:color w:val="1B4D3E"/>
           <w:sz w:val="28"/>
         </w:rPr>
-        <w:t xml:space="preserve">Honey-Glazed Char Siu    $38</w:t>
+        <w:t>Honey-Glazed Char Siu    $38</w:t>
       </w:r>
     </w:p>
     <w:p>
@@ -461,7 +419,7 @@
           <w:color w:val="888888"/>
           <w:sz w:val="20"/>
         </w:rPr>
-        <w:t xml:space="preserve">Iberico pork slow-roasted and torched with a caramelized honey glaze</w:t>
+        <w:t>Iberico pork slow-roasted and torched with a caramelized honey glaze</w:t>
       </w:r>
     </w:p>
     <w:p>
@@ -474,7 +432,7 @@
           <w:color w:val="1B4D3E"/>
           <w:sz w:val="28"/>
         </w:rPr>
-        <w:t xml:space="preserve">Tea-Smoked Duck Breast    $46</w:t>
+        <w:t>Tea-Smoked Duck Breast    $46</w:t>
       </w:r>
     </w:p>
     <w:p>
@@ -487,12 +445,11 @@
           <w:color w:val="888888"/>
           <w:sz w:val="20"/>
         </w:rPr>
-        <w:t xml:space="preserve">French duck breast smoked with Tieguanyin tea leaves, served with aged tangerine-orange sauce</w:t>
-      </w:r>
-    </w:p>
-    <w:p>
-      <w:pPr>
-        <w:pStyle w:val="Heading2"/>
+        <w:t>French duck breast smoked with Tieguanyin tea leaves, served with aged tangerine-orange sauce</w:t>
+      </w:r>
+    </w:p>
+    <w:p>
+      <w:pPr>
         <w:spacing w:before="360" w:after="160"/>
         <w:rPr>
           <w:sz w:val="32"/>
@@ -503,7 +460,7 @@
           <w:color w:val="1B4D3E"/>
           <w:sz w:val="32"/>
         </w:rPr>
-        <w:t xml:space="preserve">VEGETARIAN</w:t>
+        <w:t>VEGETARIAN</w:t>
       </w:r>
     </w:p>
     <w:p>
@@ -516,92 +473,14 @@
           <w:color w:val="1B4D3E"/>
           <w:sz w:val="28"/>
         </w:rPr>
-        <w:t xml:space="preserve">Matsutake and Seasonal Vegetables    $32</w:t>
-      </w:r>
-    </w:p>
-    <w:p>
-      <w:pPr>
-        <w:spacing w:before="40" w:after="160"/>
-      </w:pPr>
-      <w:r>
-        <w:rPr>
-          <w:i/>
-          <w:color w:val="888888"/>
-          <w:sz w:val="20"/>
-        </w:rPr>
-        <w:t xml:space="preserve">Yunnan matsutake mushrooms slow-braised with organic seasonal vegetables, exquisitely umami</w:t>
-      </w:r>
-    </w:p>
-    <w:p>
-      <w:pPr>
-        <w:spacing w:before="200" w:after="0"/>
-      </w:pPr>
-      <w:r>
-        <w:rPr>
-          <w:b/>
-          <w:color w:val="1B4D3E"/>
-          <w:sz w:val="28"/>
-        </w:rPr>
-        <w:t xml:space="preserve">Jade Garden Vegetable Medley    $20</w:t>
-      </w:r>
-    </w:p>
-    <w:p>
-      <w:pPr>
-        <w:spacing w:before="40" w:after="160"/>
-      </w:pPr>
-      <w:r>
-        <w:rPr>
-          <w:i/>
-          <w:color w:val="888888"/>
-          <w:sz w:val="20"/>
-        </w:rPr>
-        <w:t xml:space="preserve">Five-color seasonal vegetables in a delicate jade sauce, fresh and refined</w:t>
-      </w:r>
-    </w:p>
-    <w:p>
-      <w:pPr>
-        <w:spacing w:before="200" w:after="0"/>
-      </w:pPr>
-      <w:r>
-        <w:rPr>
-          <w:b/>
-          <w:color w:val="1B4D3E"/>
-          <w:sz w:val="28"/>
-        </w:rPr>
-        <w:t xml:space="preserve">Sizzling Asparagus with Miso    $18</w:t>
-      </w:r>
-    </w:p>
-    <w:p>
-      <w:pPr>
-        <w:spacing w:before="40" w:after="160"/>
-      </w:pPr>
-      <w:r>
-        <w:rPr>
-          <w:i/>
-          <w:color w:val="888888"/>
-          <w:sz w:val="20"/>
-        </w:rPr>
-        <w:t xml:space="preserve">Teppan-grilled fresh asparagus with white miso sauce and toasted sesame</w:t>
-      </w:r>
-    </w:p>
-    <w:p>
-      <w:pPr>
-        <w:spacing w:before="600" w:after="0"/>
-        <w:jc w:val="center"/>
-      </w:pPr>
-      <w:r>
-        <w:rPr>
-          <w:color w:val="888888"/>
-          <w:sz w:val="16"/>
-        </w:rPr>
-        <w:t xml:space="preserve">10% service charge applies · Prices inclusive of tax</w:t>
+        <w:t>Matsutake and Seasonal Vegetables    $32</w:t>
       </w:r>
     </w:p>
     <w:p>
       <w:pPr>
         <w:pageBreakBefore/>
         <w:spacing w:before="600" w:after="120"/>
-        <w:jc w:val="center"/>
+        <w:jc w:val="both"/>
       </w:pPr>
       <w:r>
         <w:rPr>
@@ -609,7 +488,7 @@
           <w:color w:val="C9A84C"/>
           <w:sz w:val="48"/>
         </w:rPr>
-        <w:t xml:space="preserve">DESSERTS &amp; DRINKS</w:t>
+        <w:t>DESSERTS &amp; DRINKS</w:t>
       </w:r>
     </w:p>
     <w:p>
@@ -622,7 +501,7 @@
           <w:color w:val="1B4D3E"/>
           <w:sz w:val="28"/>
         </w:rPr>
-        <w:t xml:space="preserve">Desserts &amp; Drinks</w:t>
+        <w:t>Desserts &amp; Drinks</w:t>
       </w:r>
     </w:p>
     <w:p>
@@ -641,7 +520,6 @@
     </w:p>
     <w:p>
       <w:pPr>
-        <w:pStyle w:val="Heading2"/>
         <w:spacing w:before="240" w:after="160"/>
         <w:rPr>
           <w:sz w:val="32"/>
@@ -652,7 +530,7 @@
           <w:color w:val="1B4D3E"/>
           <w:sz w:val="32"/>
         </w:rPr>
-        <w:t xml:space="preserve">DESSERTS</w:t>
+        <w:t>DESSERTS</w:t>
       </w:r>
     </w:p>
     <w:p>
@@ -665,7 +543,7 @@
           <w:color w:val="1B4D3E"/>
           <w:sz w:val="28"/>
         </w:rPr>
-        <w:t xml:space="preserve">Osmanthus Candied Lotus Root    $14</w:t>
+        <w:t>Osmanthus Candied Lotus Root    $14</w:t>
       </w:r>
     </w:p>
     <w:p>
@@ -678,7 +556,7 @@
           <w:color w:val="888888"/>
           <w:sz w:val="20"/>
         </w:rPr>
-        <w:t xml:space="preserve">Honey-glazed lotus root with osmanthus syrup and glutinous rice, served chilled</w:t>
+        <w:t>Honey-glazed lotus root with osmanthus syrup and glutinous rice, served chilled</w:t>
       </w:r>
     </w:p>
     <w:p>
@@ -691,7 +569,7 @@
           <w:color w:val="1B4D3E"/>
           <w:sz w:val="28"/>
         </w:rPr>
-        <w:t xml:space="preserve">Matcha Lava Cake    $16</w:t>
+        <w:t>Matcha Lava Cake    $16</w:t>
       </w:r>
     </w:p>
     <w:p>
@@ -704,7 +582,7 @@
           <w:color w:val="888888"/>
           <w:sz w:val="20"/>
         </w:rPr>
-        <w:t xml:space="preserve">Uji matcha molten center, accompanied by vanilla ice cream and red bean</w:t>
+        <w:t>Uji matcha molten center, accompanied by vanilla ice cream and red bean</w:t>
       </w:r>
     </w:p>
     <w:p>
@@ -717,7 +595,7 @@
           <w:color w:val="1B4D3E"/>
           <w:sz w:val="28"/>
         </w:rPr>
-        <w:t xml:space="preserve">Mango Pomelo Sago    $12</w:t>
+        <w:t>Mango Pomelo Sago    $12</w:t>
       </w:r>
     </w:p>
     <w:p>
@@ -730,12 +608,11 @@
           <w:color w:val="888888"/>
           <w:sz w:val="20"/>
         </w:rPr>
-        <w:t xml:space="preserve">Mango, grapefruit, and coconut milk with sago pearls, a Hong Kong classic</w:t>
-      </w:r>
-    </w:p>
-    <w:p>
-      <w:pPr>
-        <w:pStyle w:val="Heading2"/>
+        <w:t>Mango, grapefruit, and coconut milk with sago pearls, a Hong Kong classic</w:t>
+      </w:r>
+    </w:p>
+    <w:p>
+      <w:pPr>
         <w:spacing w:before="360" w:after="160"/>
         <w:rPr>
           <w:sz w:val="32"/>
@@ -746,7 +623,7 @@
           <w:color w:val="1B4D3E"/>
           <w:sz w:val="32"/>
         </w:rPr>
-        <w:t xml:space="preserve">DRINKS</w:t>
+        <w:t>DRINKS</w:t>
       </w:r>
     </w:p>
     <w:p>
@@ -759,7 +636,7 @@
           <w:color w:val="1B4D3E"/>
           <w:sz w:val="28"/>
         </w:rPr>
-        <w:t xml:space="preserve">Hand-Brewed Longjing    $10</w:t>
+        <w:t>Hand-Brewed Longjing    $10</w:t>
       </w:r>
     </w:p>
     <w:p>
@@ -772,7 +649,7 @@
           <w:color w:val="888888"/>
           <w:sz w:val="20"/>
         </w:rPr>
-        <w:t xml:space="preserve">Pre-Qingming West Lake Longjing, brewed to order, with a lingering sweet aftertaste</w:t>
+        <w:t>Pre-Qingming West Lake Longjing, brewed to order, with a lingering sweet aftertaste</w:t>
       </w:r>
     </w:p>
     <w:p>
@@ -785,7 +662,7 @@
           <w:color w:val="1B4D3E"/>
           <w:sz w:val="28"/>
         </w:rPr>
-        <w:t xml:space="preserve">Osmanthus Oolong    $8</w:t>
+        <w:t>Osmanthus Oolong    $8</w:t>
       </w:r>
     </w:p>
     <w:p>
@@ -798,7 +675,7 @@
           <w:color w:val="888888"/>
           <w:sz w:val="20"/>
         </w:rPr>
-        <w:t xml:space="preserve">Anxi Tieguanyin scented with osmanthus blossoms, a fragrant infusion</w:t>
+        <w:t>Anxi Tieguanyin scented with osmanthus blossoms, a fragrant infusion</w:t>
       </w:r>
     </w:p>
     <w:p>
@@ -811,7 +688,7 @@
           <w:color w:val="1B4D3E"/>
           <w:sz w:val="28"/>
         </w:rPr>
-        <w:t xml:space="preserve">Lychee Sparkling Water    $8</w:t>
+        <w:t>Lychee Sparkling Water    $8</w:t>
       </w:r>
     </w:p>
     <w:p>
@@ -824,7 +701,17 @@
           <w:color w:val="888888"/>
           <w:sz w:val="20"/>
         </w:rPr>
-        <w:t xml:space="preserve">Fresh-pressed lychee juice with sparkling soda, crisp and refreshing</w:t>
+        <w:t>Fresh-pressed lychee juice with sparkling soda, crisp a</w:t>
+      </w:r>
+      <w:bookmarkStart w:id="0" w:name="_GoBack"/>
+      <w:bookmarkEnd w:id="0"/>
+      <w:r>
+        <w:rPr>
+          <w:i/>
+          <w:color w:val="888888"/>
+          <w:sz w:val="20"/>
+        </w:rPr>
+        <w:t>nd refreshing</w:t>
       </w:r>
     </w:p>
     <w:p>
@@ -837,7 +724,7 @@
           <w:color w:val="1B4D3E"/>
           <w:sz w:val="28"/>
         </w:rPr>
-        <w:t xml:space="preserve">Aged Pu-erh    $18</w:t>
+        <w:t>Aged Pu-erh    $18</w:t>
       </w:r>
     </w:p>
     <w:p>
@@ -850,7 +737,7 @@
           <w:color w:val="888888"/>
           <w:sz w:val="20"/>
         </w:rPr>
-        <w:t xml:space="preserve">Fifteen-year aged Yunnan Pu-erh, mellow and warming</w:t>
+        <w:t>Fifteen-year aged Yunnan Pu-erh, mellow and warming</w:t>
       </w:r>
     </w:p>
     <w:p>
@@ -863,9 +750,588 @@
           <w:color w:val="888888"/>
           <w:sz w:val="16"/>
         </w:rPr>
-        <w:t xml:space="preserve">10% service charge applies · Prices inclusive of tax</w:t>
-      </w:r>
-    </w:p>
+        <w:t>10% service charge applies · Prices inclusive of tax</w:t>
+      </w:r>
+    </w:p>
+    <w:sectPr>
+      <w:pgSz w:w="11906" w:h="16838"/>
+      <w:cols w:space="720" w:num="1"/>
+      <w:docGrid w:type="lines" w:linePitch="312" w:charSpace="0"/>
+    </w:sectPr>
   </w:body>
 </w:document>
+</file>
+
+<file path=word/styles.xml><?xml version="1.0" encoding="utf-8"?>
+<w:styles xmlns:mc="http://schemas.openxmlformats.org/markup-compatibility/2006" xmlns:o="urn:schemas-microsoft-com:office:office" xmlns:r="http://schemas.openxmlformats.org/officeDocument/2006/relationships" xmlns:m="http://schemas.openxmlformats.org/officeDocument/2006/math" xmlns:v="urn:schemas-microsoft-com:vml" xmlns:w="http://schemas.openxmlformats.org/wordprocessingml/2006/main" xmlns:w14="http://schemas.microsoft.com/office/word/2010/wordml" xmlns:w10="urn:schemas-microsoft-com:office:word" xmlns:sl="http://schemas.openxmlformats.org/schemaLibrary/2006/main" xmlns:wpsCustomData="http://www.wps.cn/officeDocument/2013/wpsCustomData" mc:Ignorable="w14">
+  <w:docDefaults>
+    <w:rPrDefault>
+      <w:rPr>
+        <w:rFonts w:asciiTheme="minorHAnsi" w:hAnsiTheme="minorHAnsi" w:eastAsiaTheme="minorEastAsia" w:cstheme="minorBidi"/>
+      </w:rPr>
+    </w:rPrDefault>
+    <w:pPrDefault/>
+  </w:docDefaults>
+  <w:latentStyles w:count="260" w:defQFormat="0" w:defUnhideWhenUsed="1" w:defSemiHidden="1" w:defUIPriority="99" w:defLockedState="0">
+    <w:lsdException w:qFormat="1" w:unhideWhenUsed="0" w:uiPriority="0" w:semiHidden="0" w:name="Normal"/>
+    <w:lsdException w:qFormat="1" w:unhideWhenUsed="0" w:uiPriority="0" w:semiHidden="0" w:name="heading 1"/>
+    <w:lsdException w:qFormat="1" w:uiPriority="0" w:name="heading 2"/>
+    <w:lsdException w:qFormat="1" w:uiPriority="0" w:name="heading 3"/>
+    <w:lsdException w:qFormat="1" w:uiPriority="0" w:name="heading 4"/>
+    <w:lsdException w:qFormat="1" w:uiPriority="0" w:name="heading 5"/>
+    <w:lsdException w:qFormat="1" w:uiPriority="0" w:name="heading 6"/>
+    <w:lsdException w:qFormat="1" w:uiPriority="0" w:name="heading 7"/>
+    <w:lsdException w:qFormat="1" w:uiPriority="0" w:name="heading 8"/>
+    <w:lsdException w:qFormat="1" w:uiPriority="0" w:name="heading 9"/>
+    <w:lsdException w:unhideWhenUsed="0" w:uiPriority="0" w:semiHidden="0" w:name="index 1"/>
+    <w:lsdException w:unhideWhenUsed="0" w:uiPriority="0" w:semiHidden="0" w:name="index 2"/>
+    <w:lsdException w:unhideWhenUsed="0" w:uiPriority="0" w:semiHidden="0" w:name="index 3"/>
+    <w:lsdException w:unhideWhenUsed="0" w:uiPriority="0" w:semiHidden="0" w:name="index 4"/>
+    <w:lsdException w:unhideWhenUsed="0" w:uiPriority="0" w:semiHidden="0" w:name="index 5"/>
+    <w:lsdException w:unhideWhenUsed="0" w:uiPriority="0" w:semiHidden="0" w:name="index 6"/>
+    <w:lsdException w:unhideWhenUsed="0" w:uiPriority="0" w:semiHidden="0" w:name="index 7"/>
+    <w:lsdException w:unhideWhenUsed="0" w:uiPriority="0" w:semiHidden="0" w:name="index 8"/>
+    <w:lsdException w:unhideWhenUsed="0" w:uiPriority="0" w:semiHidden="0" w:name="index 9"/>
+    <w:lsdException w:unhideWhenUsed="0" w:uiPriority="0" w:semiHidden="0" w:name="toc 1"/>
+    <w:lsdException w:unhideWhenUsed="0" w:uiPriority="0" w:semiHidden="0" w:name="toc 2"/>
+    <w:lsdException w:unhideWhenUsed="0" w:uiPriority="0" w:semiHidden="0" w:name="toc 3"/>
+    <w:lsdException w:unhideWhenUsed="0" w:uiPriority="0" w:semiHidden="0" w:name="toc 4"/>
+    <w:lsdException w:unhideWhenUsed="0" w:uiPriority="0" w:semiHidden="0" w:name="toc 5"/>
+    <w:lsdException w:unhideWhenUsed="0" w:uiPriority="0" w:semiHidden="0" w:name="toc 6"/>
+    <w:lsdException w:unhideWhenUsed="0" w:uiPriority="0" w:semiHidden="0" w:name="toc 7"/>
+    <w:lsdException w:unhideWhenUsed="0" w:uiPriority="0" w:semiHidden="0" w:name="toc 8"/>
+    <w:lsdException w:unhideWhenUsed="0" w:uiPriority="0" w:semiHidden="0" w:name="toc 9"/>
+    <w:lsdException w:unhideWhenUsed="0" w:uiPriority="0" w:semiHidden="0" w:name="Normal Indent"/>
+    <w:lsdException w:unhideWhenUsed="0" w:uiPriority="0" w:semiHidden="0" w:name="footnote text"/>
+    <w:lsdException w:unhideWhenUsed="0" w:uiPriority="0" w:semiHidden="0" w:name="annotation text"/>
+    <w:lsdException w:unhideWhenUsed="0" w:uiPriority="0" w:semiHidden="0" w:name="header"/>
+    <w:lsdException w:unhideWhenUsed="0" w:uiPriority="0" w:semiHidden="0" w:name="footer"/>
+    <w:lsdException w:unhideWhenUsed="0" w:uiPriority="0" w:semiHidden="0" w:name="index heading"/>
+    <w:lsdException w:qFormat="1" w:uiPriority="0" w:name="caption"/>
+    <w:lsdException w:unhideWhenUsed="0" w:uiPriority="0" w:semiHidden="0" w:name="table of figures"/>
+    <w:lsdException w:unhideWhenUsed="0" w:uiPriority="0" w:semiHidden="0" w:name="envelope address"/>
+    <w:lsdException w:unhideWhenUsed="0" w:uiPriority="0" w:semiHidden="0" w:name="envelope return"/>
+    <w:lsdException w:unhideWhenUsed="0" w:uiPriority="0" w:semiHidden="0" w:name="footnote reference"/>
+    <w:lsdException w:unhideWhenUsed="0" w:uiPriority="0" w:semiHidden="0" w:name="annotation reference"/>
+    <w:lsdException w:unhideWhenUsed="0" w:uiPriority="0" w:semiHidden="0" w:name="line number"/>
+    <w:lsdException w:unhideWhenUsed="0" w:uiPriority="0" w:semiHidden="0" w:name="page number"/>
+    <w:lsdException w:unhideWhenUsed="0" w:uiPriority="0" w:semiHidden="0" w:name="endnote reference"/>
+    <w:lsdException w:unhideWhenUsed="0" w:uiPriority="0" w:semiHidden="0" w:name="endnote text"/>
+    <w:lsdException w:unhideWhenUsed="0" w:uiPriority="0" w:semiHidden="0" w:name="table of authorities"/>
+    <w:lsdException w:unhideWhenUsed="0" w:uiPriority="0" w:semiHidden="0" w:name="macro"/>
+    <w:lsdException w:unhideWhenUsed="0" w:uiPriority="0" w:semiHidden="0" w:name="toa heading"/>
+    <w:lsdException w:unhideWhenUsed="0" w:uiPriority="0" w:semiHidden="0" w:name="List"/>
+    <w:lsdException w:unhideWhenUsed="0" w:uiPriority="0" w:semiHidden="0" w:name="List Bullet"/>
+    <w:lsdException w:unhideWhenUsed="0" w:uiPriority="0" w:semiHidden="0" w:name="List Number"/>
+    <w:lsdException w:unhideWhenUsed="0" w:uiPriority="0" w:semiHidden="0" w:name="List 2"/>
+    <w:lsdException w:unhideWhenUsed="0" w:uiPriority="0" w:semiHidden="0" w:name="List 3"/>
+    <w:lsdException w:unhideWhenUsed="0" w:uiPriority="0" w:semiHidden="0" w:name="List 4"/>
+    <w:lsdException w:unhideWhenUsed="0" w:uiPriority="0" w:semiHidden="0" w:name="List 5"/>
+    <w:lsdException w:unhideWhenUsed="0" w:uiPriority="0" w:semiHidden="0" w:name="List Bullet 2"/>
+    <w:lsdException w:unhideWhenUsed="0" w:uiPriority="0" w:semiHidden="0" w:name="List Bullet 3"/>
+    <w:lsdException w:unhideWhenUsed="0" w:uiPriority="0" w:semiHidden="0" w:name="List Bullet 4"/>
+    <w:lsdException w:unhideWhenUsed="0" w:uiPriority="0" w:semiHidden="0" w:name="List Bullet 5"/>
+    <w:lsdException w:unhideWhenUsed="0" w:uiPriority="0" w:semiHidden="0" w:name="List Number 2"/>
+    <w:lsdException w:unhideWhenUsed="0" w:uiPriority="0" w:semiHidden="0" w:name="List Number 3"/>
+    <w:lsdException w:unhideWhenUsed="0" w:uiPriority="0" w:semiHidden="0" w:name="List Number 4"/>
+    <w:lsdException w:unhideWhenUsed="0" w:uiPriority="0" w:semiHidden="0" w:name="List Number 5"/>
+    <w:lsdException w:qFormat="1" w:unhideWhenUsed="0" w:uiPriority="0" w:semiHidden="0" w:name="Title"/>
+    <w:lsdException w:unhideWhenUsed="0" w:uiPriority="0" w:semiHidden="0" w:name="Closing"/>
+    <w:lsdException w:unhideWhenUsed="0" w:uiPriority="0" w:semiHidden="0" w:name="Signature"/>
+    <w:lsdException w:unhideWhenUsed="0" w:uiPriority="0" w:name="Default Paragraph Font"/>
+    <w:lsdException w:unhideWhenUsed="0" w:uiPriority="0" w:semiHidden="0" w:name="Body Text"/>
+    <w:lsdException w:unhideWhenUsed="0" w:uiPriority="0" w:semiHidden="0" w:name="Body Text Indent"/>
+    <w:lsdException w:unhideWhenUsed="0" w:uiPriority="0" w:semiHidden="0" w:name="List Continue"/>
+    <w:lsdException w:unhideWhenUsed="0" w:uiPriority="0" w:semiHidden="0" w:name="List Continue 2"/>
+    <w:lsdException w:unhideWhenUsed="0" w:uiPriority="0" w:semiHidden="0" w:name="List Continue 3"/>
+    <w:lsdException w:unhideWhenUsed="0" w:uiPriority="0" w:semiHidden="0" w:name="List Continue 4"/>
+    <w:lsdException w:unhideWhenUsed="0" w:uiPriority="0" w:semiHidden="0" w:name="List Continue 5"/>
+    <w:lsdException w:unhideWhenUsed="0" w:uiPriority="0" w:semiHidden="0" w:name="Message Header"/>
+    <w:lsdException w:qFormat="1" w:unhideWhenUsed="0" w:uiPriority="0" w:semiHidden="0" w:name="Subtitle"/>
+    <w:lsdException w:unhideWhenUsed="0" w:uiPriority="0" w:semiHidden="0" w:name="Salutation"/>
+    <w:lsdException w:unhideWhenUsed="0" w:uiPriority="0" w:semiHidden="0" w:name="Date"/>
+    <w:lsdException w:unhideWhenUsed="0" w:uiPriority="0" w:semiHidden="0" w:name="Body Text First Indent"/>
+    <w:lsdException w:unhideWhenUsed="0" w:uiPriority="0" w:semiHidden="0" w:name="Body Text First Indent 2"/>
+    <w:lsdException w:unhideWhenUsed="0" w:uiPriority="0" w:semiHidden="0" w:name="Note Heading"/>
+    <w:lsdException w:unhideWhenUsed="0" w:uiPriority="0" w:semiHidden="0" w:name="Body Text 2"/>
+    <w:lsdException w:unhideWhenUsed="0" w:uiPriority="0" w:semiHidden="0" w:name="Body Text 3"/>
+    <w:lsdException w:unhideWhenUsed="0" w:uiPriority="0" w:semiHidden="0" w:name="Body Text Indent 2"/>
+    <w:lsdException w:unhideWhenUsed="0" w:uiPriority="0" w:semiHidden="0" w:name="Body Text Indent 3"/>
+    <w:lsdException w:unhideWhenUsed="0" w:uiPriority="0" w:semiHidden="0" w:name="Block Text"/>
+    <w:lsdException w:unhideWhenUsed="0" w:uiPriority="0" w:semiHidden="0" w:name="Hyperlink"/>
+    <w:lsdException w:unhideWhenUsed="0" w:uiPriority="0" w:semiHidden="0" w:name="FollowedHyperlink"/>
+    <w:lsdException w:qFormat="1" w:unhideWhenUsed="0" w:uiPriority="0" w:semiHidden="0" w:name="Strong"/>
+    <w:lsdException w:qFormat="1" w:unhideWhenUsed="0" w:uiPriority="0" w:semiHidden="0" w:name="Emphasis"/>
+    <w:lsdException w:unhideWhenUsed="0" w:uiPriority="0" w:semiHidden="0" w:name="Document Map"/>
+    <w:lsdException w:unhideWhenUsed="0" w:uiPriority="0" w:semiHidden="0" w:name="Plain Text"/>
+    <w:lsdException w:unhideWhenUsed="0" w:uiPriority="0" w:semiHidden="0" w:name="E-mail Signature"/>
+    <w:lsdException w:unhideWhenUsed="0" w:uiPriority="0" w:semiHidden="0" w:name="Normal (Web)"/>
+    <w:lsdException w:unhideWhenUsed="0" w:uiPriority="0" w:semiHidden="0" w:name="HTML Acronym"/>
+    <w:lsdException w:unhideWhenUsed="0" w:uiPriority="0" w:semiHidden="0" w:name="HTML Address"/>
+    <w:lsdException w:unhideWhenUsed="0" w:uiPriority="0" w:semiHidden="0" w:name="HTML Cite"/>
+    <w:lsdException w:unhideWhenUsed="0" w:uiPriority="0" w:semiHidden="0" w:name="HTML Code"/>
+    <w:lsdException w:unhideWhenUsed="0" w:uiPriority="0" w:semiHidden="0" w:name="HTML Definition"/>
+    <w:lsdException w:unhideWhenUsed="0" w:uiPriority="0" w:semiHidden="0" w:name="HTML Keyboard"/>
+    <w:lsdException w:unhideWhenUsed="0" w:uiPriority="0" w:semiHidden="0" w:name="HTML Preformatted"/>
+    <w:lsdException w:unhideWhenUsed="0" w:uiPriority="0" w:semiHidden="0" w:name="HTML Sample"/>
+    <w:lsdException w:unhideWhenUsed="0" w:uiPriority="0" w:semiHidden="0" w:name="HTML Typewriter"/>
+    <w:lsdException w:unhideWhenUsed="0" w:uiPriority="0" w:semiHidden="0" w:name="HTML Variable"/>
+    <w:lsdException w:unhideWhenUsed="0" w:uiPriority="0" w:name="Normal Table"/>
+    <w:lsdException w:unhideWhenUsed="0" w:uiPriority="0" w:semiHidden="0" w:name="annotation subject"/>
+    <w:lsdException w:unhideWhenUsed="0" w:uiPriority="0" w:semiHidden="0" w:name="Table Simple 1"/>
+    <w:lsdException w:unhideWhenUsed="0" w:uiPriority="0" w:semiHidden="0" w:name="Table Simple 2"/>
+    <w:lsdException w:unhideWhenUsed="0" w:uiPriority="0" w:semiHidden="0" w:name="Table Simple 3"/>
+    <w:lsdException w:unhideWhenUsed="0" w:uiPriority="0" w:semiHidden="0" w:name="Table Classic 1"/>
+    <w:lsdException w:unhideWhenUsed="0" w:uiPriority="0" w:semiHidden="0" w:name="Table Classic 2"/>
+    <w:lsdException w:unhideWhenUsed="0" w:uiPriority="0" w:semiHidden="0" w:name="Table Classic 3"/>
+    <w:lsdException w:unhideWhenUsed="0" w:uiPriority="0" w:semiHidden="0" w:name="Table Classic 4"/>
+    <w:lsdException w:unhideWhenUsed="0" w:uiPriority="0" w:semiHidden="0" w:name="Table Colorful 1"/>
+    <w:lsdException w:unhideWhenUsed="0" w:uiPriority="0" w:semiHidden="0" w:name="Table Colorful 2"/>
+    <w:lsdException w:unhideWhenUsed="0" w:uiPriority="0" w:semiHidden="0" w:name="Table Colorful 3"/>
+    <w:lsdException w:unhideWhenUsed="0" w:uiPriority="0" w:semiHidden="0" w:name="Table Columns 1"/>
+    <w:lsdException w:unhideWhenUsed="0" w:uiPriority="0" w:semiHidden="0" w:name="Table Columns 2"/>
+    <w:lsdException w:unhideWhenUsed="0" w:uiPriority="0" w:semiHidden="0" w:name="Table Columns 3"/>
+    <w:lsdException w:unhideWhenUsed="0" w:uiPriority="0" w:semiHidden="0" w:name="Table Columns 4"/>
+    <w:lsdException w:unhideWhenUsed="0" w:uiPriority="0" w:semiHidden="0" w:name="Table Columns 5"/>
+    <w:lsdException w:unhideWhenUsed="0" w:uiPriority="0" w:semiHidden="0" w:name="Table Grid 1"/>
+    <w:lsdException w:unhideWhenUsed="0" w:uiPriority="0" w:semiHidden="0" w:name="Table Grid 2"/>
+    <w:lsdException w:unhideWhenUsed="0" w:uiPriority="0" w:semiHidden="0" w:name="Table Grid 3"/>
+    <w:lsdException w:unhideWhenUsed="0" w:uiPriority="0" w:semiHidden="0" w:name="Table Grid 4"/>
+    <w:lsdException w:unhideWhenUsed="0" w:uiPriority="0" w:semiHidden="0" w:name="Table Grid 5"/>
+    <w:lsdException w:unhideWhenUsed="0" w:uiPriority="0" w:semiHidden="0" w:name="Table Grid 6"/>
+    <w:lsdException w:unhideWhenUsed="0" w:uiPriority="0" w:semiHidden="0" w:name="Table Grid 7"/>
+    <w:lsdException w:unhideWhenUsed="0" w:uiPriority="0" w:semiHidden="0" w:name="Table Grid 8"/>
+    <w:lsdException w:unhideWhenUsed="0" w:uiPriority="0" w:semiHidden="0" w:name="Table List 1"/>
+    <w:lsdException w:unhideWhenUsed="0" w:uiPriority="0" w:semiHidden="0" w:name="Table List 2"/>
+    <w:lsdException w:unhideWhenUsed="0" w:uiPriority="0" w:semiHidden="0" w:name="Table List 3"/>
+    <w:lsdException w:unhideWhenUsed="0" w:uiPriority="0" w:semiHidden="0" w:name="Table List 4"/>
+    <w:lsdException w:unhideWhenUsed="0" w:uiPriority="0" w:semiHidden="0" w:name="Table List 5"/>
+    <w:lsdException w:unhideWhenUsed="0" w:uiPriority="0" w:semiHidden="0" w:name="Table List 6"/>
+    <w:lsdException w:unhideWhenUsed="0" w:uiPriority="0" w:semiHidden="0" w:name="Table List 7"/>
+    <w:lsdException w:unhideWhenUsed="0" w:uiPriority="0" w:semiHidden="0" w:name="Table List 8"/>
+    <w:lsdException w:unhideWhenUsed="0" w:uiPriority="0" w:semiHidden="0" w:name="Table 3D effects 1"/>
+    <w:lsdException w:unhideWhenUsed="0" w:uiPriority="0" w:semiHidden="0" w:name="Table 3D effects 2"/>
+    <w:lsdException w:unhideWhenUsed="0" w:uiPriority="0" w:semiHidden="0" w:name="Table 3D effects 3"/>
+    <w:lsdException w:unhideWhenUsed="0" w:uiPriority="0" w:semiHidden="0" w:name="Table Contemporary"/>
+    <w:lsdException w:unhideWhenUsed="0" w:uiPriority="0" w:semiHidden="0" w:name="Table Elegant"/>
+    <w:lsdException w:unhideWhenUsed="0" w:uiPriority="0" w:semiHidden="0" w:name="Table Professional"/>
+    <w:lsdException w:unhideWhenUsed="0" w:uiPriority="0" w:semiHidden="0" w:name="Table Subtle 1"/>
+    <w:lsdException w:unhideWhenUsed="0" w:uiPriority="0" w:semiHidden="0" w:name="Table Subtle 2"/>
+    <w:lsdException w:unhideWhenUsed="0" w:uiPriority="0" w:semiHidden="0" w:name="Table Web 1"/>
+    <w:lsdException w:unhideWhenUsed="0" w:uiPriority="0" w:semiHidden="0" w:name="Table Web 2"/>
+    <w:lsdException w:unhideWhenUsed="0" w:uiPriority="0" w:semiHidden="0" w:name="Table Web 3"/>
+    <w:lsdException w:unhideWhenUsed="0" w:uiPriority="0" w:semiHidden="0" w:name="Balloon Text"/>
+    <w:lsdException w:unhideWhenUsed="0" w:uiPriority="0" w:semiHidden="0" w:name="Table Grid"/>
+    <w:lsdException w:unhideWhenUsed="0" w:uiPriority="0" w:semiHidden="0" w:name="Table Theme"/>
+    <w:lsdException w:unhideWhenUsed="0" w:uiPriority="60" w:semiHidden="0" w:name="Light Shading"/>
+    <w:lsdException w:unhideWhenUsed="0" w:uiPriority="61" w:semiHidden="0" w:name="Light List"/>
+    <w:lsdException w:unhideWhenUsed="0" w:uiPriority="62" w:semiHidden="0" w:name="Light Grid"/>
+    <w:lsdException w:unhideWhenUsed="0" w:uiPriority="63" w:semiHidden="0" w:name="Medium Shading 1"/>
+    <w:lsdException w:unhideWhenUsed="0" w:uiPriority="64" w:semiHidden="0" w:name="Medium Shading 2"/>
+    <w:lsdException w:unhideWhenUsed="0" w:uiPriority="65" w:semiHidden="0" w:name="Medium List 1"/>
+    <w:lsdException w:unhideWhenUsed="0" w:uiPriority="66" w:semiHidden="0" w:name="Medium List 2"/>
+    <w:lsdException w:unhideWhenUsed="0" w:uiPriority="67" w:semiHidden="0" w:name="Medium Grid 1"/>
+    <w:lsdException w:unhideWhenUsed="0" w:uiPriority="68" w:semiHidden="0" w:name="Medium Grid 2"/>
+    <w:lsdException w:unhideWhenUsed="0" w:uiPriority="69" w:semiHidden="0" w:name="Medium Grid 3"/>
+    <w:lsdException w:unhideWhenUsed="0" w:uiPriority="70" w:semiHidden="0" w:name="Dark List"/>
+    <w:lsdException w:unhideWhenUsed="0" w:uiPriority="71" w:semiHidden="0" w:name="Colorful Shading"/>
+    <w:lsdException w:unhideWhenUsed="0" w:uiPriority="72" w:semiHidden="0" w:name="Colorful List"/>
+    <w:lsdException w:unhideWhenUsed="0" w:uiPriority="73" w:semiHidden="0" w:name="Colorful Grid"/>
+    <w:lsdException w:unhideWhenUsed="0" w:uiPriority="60" w:semiHidden="0" w:name="Light Shading Accent 1"/>
+    <w:lsdException w:unhideWhenUsed="0" w:uiPriority="61" w:semiHidden="0" w:name="Light List Accent 1"/>
+    <w:lsdException w:unhideWhenUsed="0" w:uiPriority="62" w:semiHidden="0" w:name="Light Grid Accent 1"/>
+    <w:lsdException w:unhideWhenUsed="0" w:uiPriority="63" w:semiHidden="0" w:name="Medium Shading 1 Accent 1"/>
+    <w:lsdException w:unhideWhenUsed="0" w:uiPriority="64" w:semiHidden="0" w:name="Medium Shading 2 Accent 1"/>
+    <w:lsdException w:unhideWhenUsed="0" w:uiPriority="65" w:semiHidden="0" w:name="Medium List 1 Accent 1"/>
+    <w:lsdException w:unhideWhenUsed="0" w:uiPriority="66" w:semiHidden="0" w:name="Medium List 2 Accent 1"/>
+    <w:lsdException w:unhideWhenUsed="0" w:uiPriority="67" w:semiHidden="0" w:name="Medium Grid 1 Accent 1"/>
+    <w:lsdException w:unhideWhenUsed="0" w:uiPriority="68" w:semiHidden="0" w:name="Medium Grid 2 Accent 1"/>
+    <w:lsdException w:unhideWhenUsed="0" w:uiPriority="69" w:semiHidden="0" w:name="Medium Grid 3 Accent 1"/>
+    <w:lsdException w:unhideWhenUsed="0" w:uiPriority="70" w:semiHidden="0" w:name="Dark List Accent 1"/>
+    <w:lsdException w:unhideWhenUsed="0" w:uiPriority="71" w:semiHidden="0" w:name="Colorful Shading Accent 1"/>
+    <w:lsdException w:unhideWhenUsed="0" w:uiPriority="72" w:semiHidden="0" w:name="Colorful List Accent 1"/>
+    <w:lsdException w:unhideWhenUsed="0" w:uiPriority="73" w:semiHidden="0" w:name="Colorful Grid Accent 1"/>
+    <w:lsdException w:unhideWhenUsed="0" w:uiPriority="60" w:semiHidden="0" w:name="Light Shading Accent 2"/>
+    <w:lsdException w:unhideWhenUsed="0" w:uiPriority="61" w:semiHidden="0" w:name="Light List Accent 2"/>
+    <w:lsdException w:unhideWhenUsed="0" w:uiPriority="62" w:semiHidden="0" w:name="Light Grid Accent 2"/>
+    <w:lsdException w:unhideWhenUsed="0" w:uiPriority="63" w:semiHidden="0" w:name="Medium Shading 1 Accent 2"/>
+    <w:lsdException w:unhideWhenUsed="0" w:uiPriority="64" w:semiHidden="0" w:name="Medium Shading 2 Accent 2"/>
+    <w:lsdException w:unhideWhenUsed="0" w:uiPriority="65" w:semiHidden="0" w:name="Medium List 1 Accent 2"/>
+    <w:lsdException w:unhideWhenUsed="0" w:uiPriority="66" w:semiHidden="0" w:name="Medium List 2 Accent 2"/>
+    <w:lsdException w:unhideWhenUsed="0" w:uiPriority="67" w:semiHidden="0" w:name="Medium Grid 1 Accent 2"/>
+    <w:lsdException w:unhideWhenUsed="0" w:uiPriority="68" w:semiHidden="0" w:name="Medium Grid 2 Accent 2"/>
+    <w:lsdException w:unhideWhenUsed="0" w:uiPriority="69" w:semiHidden="0" w:name="Medium Grid 3 Accent 2"/>
+    <w:lsdException w:unhideWhenUsed="0" w:uiPriority="70" w:semiHidden="0" w:name="Dark List Accent 2"/>
+    <w:lsdException w:unhideWhenUsed="0" w:uiPriority="71" w:semiHidden="0" w:name="Colorful Shading Accent 2"/>
+    <w:lsdException w:unhideWhenUsed="0" w:uiPriority="72" w:semiHidden="0" w:name="Colorful List Accent 2"/>
+    <w:lsdException w:unhideWhenUsed="0" w:uiPriority="73" w:semiHidden="0" w:name="Colorful Grid Accent 2"/>
+    <w:lsdException w:unhideWhenUsed="0" w:uiPriority="60" w:semiHidden="0" w:name="Light Shading Accent 3"/>
+    <w:lsdException w:unhideWhenUsed="0" w:uiPriority="61" w:semiHidden="0" w:name="Light List Accent 3"/>
+    <w:lsdException w:unhideWhenUsed="0" w:uiPriority="62" w:semiHidden="0" w:name="Light Grid Accent 3"/>
+    <w:lsdException w:unhideWhenUsed="0" w:uiPriority="63" w:semiHidden="0" w:name="Medium Shading 1 Accent 3"/>
+    <w:lsdException w:unhideWhenUsed="0" w:uiPriority="64" w:semiHidden="0" w:name="Medium Shading 2 Accent 3"/>
+    <w:lsdException w:unhideWhenUsed="0" w:uiPriority="65" w:semiHidden="0" w:name="Medium List 1 Accent 3"/>
+    <w:lsdException w:unhideWhenUsed="0" w:uiPriority="66" w:semiHidden="0" w:name="Medium List 2 Accent 3"/>
+    <w:lsdException w:unhideWhenUsed="0" w:uiPriority="67" w:semiHidden="0" w:name="Medium Grid 1 Accent 3"/>
+    <w:lsdException w:unhideWhenUsed="0" w:uiPriority="68" w:semiHidden="0" w:name="Medium Grid 2 Accent 3"/>
+    <w:lsdException w:unhideWhenUsed="0" w:uiPriority="69" w:semiHidden="0" w:name="Medium Grid 3 Accent 3"/>
+    <w:lsdException w:unhideWhenUsed="0" w:uiPriority="70" w:semiHidden="0" w:name="Dark List Accent 3"/>
+    <w:lsdException w:unhideWhenUsed="0" w:uiPriority="71" w:semiHidden="0" w:name="Colorful Shading Accent 3"/>
+    <w:lsdException w:unhideWhenUsed="0" w:uiPriority="72" w:semiHidden="0" w:name="Colorful List Accent 3"/>
+    <w:lsdException w:unhideWhenUsed="0" w:uiPriority="73" w:semiHidden="0" w:name="Colorful Grid Accent 3"/>
+    <w:lsdException w:unhideWhenUsed="0" w:uiPriority="60" w:semiHidden="0" w:name="Light Shading Accent 4"/>
+    <w:lsdException w:unhideWhenUsed="0" w:uiPriority="61" w:semiHidden="0" w:name="Light List Accent 4"/>
+    <w:lsdException w:unhideWhenUsed="0" w:uiPriority="62" w:semiHidden="0" w:name="Light Grid Accent 4"/>
+    <w:lsdException w:unhideWhenUsed="0" w:uiPriority="63" w:semiHidden="0" w:name="Medium Shading 1 Accent 4"/>
+    <w:lsdException w:unhideWhenUsed="0" w:uiPriority="64" w:semiHidden="0" w:name="Medium Shading 2 Accent 4"/>
+    <w:lsdException w:unhideWhenUsed="0" w:uiPriority="65" w:semiHidden="0" w:name="Medium List 1 Accent 4"/>
+    <w:lsdException w:unhideWhenUsed="0" w:uiPriority="66" w:semiHidden="0" w:name="Medium List 2 Accent 4"/>
+    <w:lsdException w:unhideWhenUsed="0" w:uiPriority="67" w:semiHidden="0" w:name="Medium Grid 1 Accent 4"/>
+    <w:lsdException w:unhideWhenUsed="0" w:uiPriority="68" w:semiHidden="0" w:name="Medium Grid 2 Accent 4"/>
+    <w:lsdException w:unhideWhenUsed="0" w:uiPriority="69" w:semiHidden="0" w:name="Medium Grid 3 Accent 4"/>
+    <w:lsdException w:unhideWhenUsed="0" w:uiPriority="70" w:semiHidden="0" w:name="Dark List Accent 4"/>
+    <w:lsdException w:unhideWhenUsed="0" w:uiPriority="71" w:semiHidden="0" w:name="Colorful Shading Accent 4"/>
+    <w:lsdException w:unhideWhenUsed="0" w:uiPriority="72" w:semiHidden="0" w:name="Colorful List Accent 4"/>
+    <w:lsdException w:unhideWhenUsed="0" w:uiPriority="73" w:semiHidden="0" w:name="Colorful Grid Accent 4"/>
+    <w:lsdException w:unhideWhenUsed="0" w:uiPriority="60" w:semiHidden="0" w:name="Light Shading Accent 5"/>
+    <w:lsdException w:unhideWhenUsed="0" w:uiPriority="61" w:semiHidden="0" w:name="Light List Accent 5"/>
+    <w:lsdException w:unhideWhenUsed="0" w:uiPriority="62" w:semiHidden="0" w:name="Light Grid Accent 5"/>
+    <w:lsdException w:unhideWhenUsed="0" w:uiPriority="63" w:semiHidden="0" w:name="Medium Shading 1 Accent 5"/>
+    <w:lsdException w:unhideWhenUsed="0" w:uiPriority="64" w:semiHidden="0" w:name="Medium Shading 2 Accent 5"/>
+    <w:lsdException w:unhideWhenUsed="0" w:uiPriority="65" w:semiHidden="0" w:name="Medium List 1 Accent 5"/>
+    <w:lsdException w:unhideWhenUsed="0" w:uiPriority="66" w:semiHidden="0" w:name="Medium List 2 Accent 5"/>
+    <w:lsdException w:unhideWhenUsed="0" w:uiPriority="67" w:semiHidden="0" w:name="Medium Grid 1 Accent 5"/>
+    <w:lsdException w:unhideWhenUsed="0" w:uiPriority="68" w:semiHidden="0" w:name="Medium Grid 2 Accent 5"/>
+    <w:lsdException w:unhideWhenUsed="0" w:uiPriority="69" w:semiHidden="0" w:name="Medium Grid 3 Accent 5"/>
+    <w:lsdException w:unhideWhenUsed="0" w:uiPriority="70" w:semiHidden="0" w:name="Dark List Accent 5"/>
+    <w:lsdException w:unhideWhenUsed="0" w:uiPriority="71" w:semiHidden="0" w:name="Colorful Shading Accent 5"/>
+    <w:lsdException w:unhideWhenUsed="0" w:uiPriority="72" w:semiHidden="0" w:name="Colorful List Accent 5"/>
+    <w:lsdException w:unhideWhenUsed="0" w:uiPriority="73" w:semiHidden="0" w:name="Colorful Grid Accent 5"/>
+    <w:lsdException w:unhideWhenUsed="0" w:uiPriority="60" w:semiHidden="0" w:name="Light Shading Accent 6"/>
+    <w:lsdException w:unhideWhenUsed="0" w:uiPriority="61" w:semiHidden="0" w:name="Light List Accent 6"/>
+    <w:lsdException w:unhideWhenUsed="0" w:uiPriority="62" w:semiHidden="0" w:name="Light Grid Accent 6"/>
+    <w:lsdException w:unhideWhenUsed="0" w:uiPriority="63" w:semiHidden="0" w:name="Medium Shading 1 Accent 6"/>
+    <w:lsdException w:unhideWhenUsed="0" w:uiPriority="64" w:semiHidden="0" w:name="Medium Shading 2 Accent 6"/>
+    <w:lsdException w:unhideWhenUsed="0" w:uiPriority="65" w:semiHidden="0" w:name="Medium List 1 Accent 6"/>
+    <w:lsdException w:unhideWhenUsed="0" w:uiPriority="66" w:semiHidden="0" w:name="Medium List 2 Accent 6"/>
+    <w:lsdException w:unhideWhenUsed="0" w:uiPriority="67" w:semiHidden="0" w:name="Medium Grid 1 Accent 6"/>
+    <w:lsdException w:unhideWhenUsed="0" w:uiPriority="68" w:semiHidden="0" w:name="Medium Grid 2 Accent 6"/>
+    <w:lsdException w:unhideWhenUsed="0" w:uiPriority="69" w:semiHidden="0" w:name="Medium Grid 3 Accent 6"/>
+    <w:lsdException w:unhideWhenUsed="0" w:uiPriority="70" w:semiHidden="0" w:name="Dark List Accent 6"/>
+    <w:lsdException w:unhideWhenUsed="0" w:uiPriority="71" w:semiHidden="0" w:name="Colorful Shading Accent 6"/>
+    <w:lsdException w:unhideWhenUsed="0" w:uiPriority="72" w:semiHidden="0" w:name="Colorful List Accent 6"/>
+    <w:lsdException w:unhideWhenUsed="0" w:uiPriority="73" w:semiHidden="0" w:name="Colorful Grid Accent 6"/>
+  </w:latentStyles>
+  <w:style w:type="paragraph" w:default="1" w:styleId="1">
+    <w:name w:val="Normal"/>
+    <w:qFormat/>
+    <w:uiPriority w:val="0"/>
+    <w:rPr>
+      <w:sz w:val="21"/>
+      <w:szCs w:val="22"/>
+    </w:rPr>
+  </w:style>
+  <w:style w:type="character" w:default="1" w:styleId="2">
+    <w:name w:val="Default Paragraph Font"/>
+    <w:semiHidden/>
+    <w:uiPriority w:val="0"/>
+  </w:style>
+  <w:style w:type="table" w:default="1" w:styleId="3">
+    <w:name w:val="Normal Table"/>
+    <w:semiHidden/>
+    <w:uiPriority w:val="0"/>
+    <w:tblPr>
+      <w:tblCellMar>
+        <w:top w:w="0" w:type="dxa"/>
+        <w:left w:w="108" w:type="dxa"/>
+        <w:bottom w:w="0" w:type="dxa"/>
+        <w:right w:w="108" w:type="dxa"/>
+      </w:tblCellMar>
+    </w:tblPr>
+  </w:style>
+</w:styles>
+</file>
+
+<file path=word/theme/theme1.xml><?xml version="1.0" encoding="utf-8"?>
+<a:theme xmlns:a="http://schemas.openxmlformats.org/drawingml/2006/main" name="Office">
+  <a:themeElements>
+    <a:clrScheme name="Office">
+      <a:dk1>
+        <a:sysClr val="windowText" lastClr="000000"/>
+      </a:dk1>
+      <a:lt1>
+        <a:sysClr val="window" lastClr="FFFFFF"/>
+      </a:lt1>
+      <a:dk2>
+        <a:srgbClr val="1F497D"/>
+      </a:dk2>
+      <a:lt2>
+        <a:srgbClr val="EEECE1"/>
+      </a:lt2>
+      <a:accent1>
+        <a:srgbClr val="4F81BD"/>
+      </a:accent1>
+      <a:accent2>
+        <a:srgbClr val="C0504D"/>
+      </a:accent2>
+      <a:accent3>
+        <a:srgbClr val="9BBB59"/>
+      </a:accent3>
+      <a:accent4>
+        <a:srgbClr val="8064A2"/>
+      </a:accent4>
+      <a:accent5>
+        <a:srgbClr val="4BACC6"/>
+      </a:accent5>
+      <a:accent6>
+        <a:srgbClr val="F79646"/>
+      </a:accent6>
+      <a:hlink>
+        <a:srgbClr val="0000FF"/>
+      </a:hlink>
+      <a:folHlink>
+        <a:srgbClr val="800080"/>
+      </a:folHlink>
+    </a:clrScheme>
+    <a:fontScheme name="Office">
+      <a:majorFont>
+        <a:latin typeface="Cambria"/>
+        <a:ea typeface=""/>
+        <a:cs typeface=""/>
+        <a:font script="Jpan" typeface="ＭＳ ゴシック"/>
+        <a:font script="Hang" typeface="맑은 고딕"/>
+        <a:font script="Hans" typeface="宋体"/>
+        <a:font script="Hant" typeface="新細明體"/>
+        <a:font script="Arab" typeface="Times New Roman"/>
+        <a:font script="Hebr" typeface="Times New Roman"/>
+        <a:font script="Thai" typeface="Angsana New"/>
+        <a:font script="Ethi" typeface="Nyala"/>
+        <a:font script="Beng" typeface="Vrinda"/>
+        <a:font script="Gujr" typeface="Shruti"/>
+        <a:font script="Khmr" typeface="MoolBoran"/>
+        <a:font script="Knda" typeface="Tunga"/>
+        <a:font script="Guru" typeface="Raavi"/>
+        <a:font script="Cans" typeface="Euphemia"/>
+        <a:font script="Cher" typeface="Plantagenet Cherokee"/>
+        <a:font script="Yiii" typeface="Microsoft Yi Baiti"/>
+        <a:font script="Tibt" typeface="Microsoft Himalaya"/>
+        <a:font script="Thaa" typeface="MV Boli"/>
+        <a:font script="Deva" typeface="Mangal"/>
+        <a:font script="Telu" typeface="Gautami"/>
+        <a:font script="Taml" typeface="Latha"/>
+        <a:font script="Syrc" typeface="Estrangelo Edessa"/>
+        <a:font script="Orya" typeface="Kalinga"/>
+        <a:font script="Mlym" typeface="Kartika"/>
+        <a:font script="Laoo" typeface="DokChampa"/>
+        <a:font script="Sinh" typeface="Iskoola Pota"/>
+        <a:font script="Mong" typeface="Mongolian Baiti"/>
+        <a:font script="Viet" typeface="Times New Roman"/>
+        <a:font script="Uigh" typeface="Microsoft Uighur"/>
+        <a:font script="Geor" typeface="Sylfaen"/>
+      </a:majorFont>
+      <a:minorFont>
+        <a:latin typeface="Calibri"/>
+        <a:ea typeface=""/>
+        <a:cs typeface=""/>
+        <a:font script="Jpan" typeface="ＭＳ 明朝"/>
+        <a:font script="Hang" typeface="맑은 고딕"/>
+        <a:font script="Hans" typeface="宋体"/>
+        <a:font script="Hant" typeface="新細明體"/>
+        <a:font script="Arab" typeface="Arial"/>
+        <a:font script="Hebr" typeface="Arial"/>
+        <a:font script="Thai" typeface="Cordia New"/>
+        <a:font script="Ethi" typeface="Nyala"/>
+        <a:font script="Beng" typeface="Vrinda"/>
+        <a:font script="Gujr" typeface="Shruti"/>
+        <a:font script="Khmr" typeface="DaunPenh"/>
+        <a:font script="Knda" typeface="Tunga"/>
+        <a:font script="Guru" typeface="Raavi"/>
+        <a:font script="Cans" typeface="Euphemia"/>
+        <a:font script="Cher" typeface="Plantagenet Cherokee"/>
+        <a:font script="Yiii" typeface="Microsoft Yi Baiti"/>
+        <a:font script="Tibt" typeface="Microsoft Himalaya"/>
+        <a:font script="Thaa" typeface="MV Boli"/>
+        <a:font script="Deva" typeface="Mangal"/>
+        <a:font script="Telu" typeface="Gautami"/>
+        <a:font script="Taml" typeface="Latha"/>
+        <a:font script="Syrc" typeface="Estrangelo Edessa"/>
+        <a:font script="Orya" typeface="Kalinga"/>
+        <a:font script="Mlym" typeface="Kartika"/>
+        <a:font script="Laoo" typeface="DokChampa"/>
+        <a:font script="Sinh" typeface="Iskoola Pota"/>
+        <a:font script="Mong" typeface="Mongolian Baiti"/>
+        <a:font script="Viet" typeface="Arial"/>
+        <a:font script="Uigh" typeface="Microsoft Uighur"/>
+        <a:font script="Geor" typeface="Sylfaen"/>
+      </a:minorFont>
+    </a:fontScheme>
+    <a:fmtScheme name="Office">
+      <a:fillStyleLst>
+        <a:solidFill>
+          <a:schemeClr val="phClr"/>
+        </a:solidFill>
+        <a:gradFill rotWithShape="1">
+          <a:gsLst>
+            <a:gs pos="0">
+              <a:schemeClr val="phClr">
+                <a:tint val="50000"/>
+                <a:satMod val="300000"/>
+              </a:schemeClr>
+            </a:gs>
+            <a:gs pos="35000">
+              <a:schemeClr val="phClr">
+                <a:tint val="37000"/>
+                <a:satMod val="300000"/>
+              </a:schemeClr>
+            </a:gs>
+            <a:gs pos="100000">
+              <a:schemeClr val="phClr">
+                <a:tint val="15000"/>
+                <a:satMod val="350000"/>
+              </a:schemeClr>
+            </a:gs>
+          </a:gsLst>
+          <a:lin ang="16200000" scaled="1"/>
+        </a:gradFill>
+        <a:gradFill rotWithShape="1">
+          <a:gsLst>
+            <a:gs pos="0">
+              <a:schemeClr val="phClr">
+                <a:shade val="51000"/>
+                <a:satMod val="130000"/>
+              </a:schemeClr>
+            </a:gs>
+            <a:gs pos="80000">
+              <a:schemeClr val="phClr">
+                <a:shade val="93000"/>
+                <a:satMod val="130000"/>
+              </a:schemeClr>
+            </a:gs>
+            <a:gs pos="100000">
+              <a:schemeClr val="phClr">
+                <a:shade val="94000"/>
+                <a:satMod val="135000"/>
+              </a:schemeClr>
+            </a:gs>
+          </a:gsLst>
+          <a:lin ang="16200000" scaled="0"/>
+        </a:gradFill>
+      </a:fillStyleLst>
+      <a:lnStyleLst>
+        <a:ln w="9525" cap="flat" cmpd="sng" algn="ctr">
+          <a:solidFill>
+            <a:schemeClr val="phClr">
+              <a:shade val="95000"/>
+              <a:satMod val="105000"/>
+            </a:schemeClr>
+          </a:solidFill>
+          <a:prstDash val="solid"/>
+        </a:ln>
+        <a:ln w="25400" cap="flat" cmpd="sng" algn="ctr">
+          <a:solidFill>
+            <a:schemeClr val="phClr"/>
+          </a:solidFill>
+          <a:prstDash val="solid"/>
+        </a:ln>
+        <a:ln w="38100" cap="flat" cmpd="sng" algn="ctr">
+          <a:solidFill>
+            <a:schemeClr val="phClr"/>
+          </a:solidFill>
+          <a:prstDash val="solid"/>
+        </a:ln>
+      </a:lnStyleLst>
+      <a:effectStyleLst>
+        <a:effectStyle>
+          <a:effectLst>
+            <a:outerShdw blurRad="40000" dist="20000" dir="5400000" rotWithShape="0">
+              <a:srgbClr val="000000">
+                <a:alpha val="38000"/>
+              </a:srgbClr>
+            </a:outerShdw>
+          </a:effectLst>
+        </a:effectStyle>
+        <a:effectStyle>
+          <a:effectLst>
+            <a:outerShdw blurRad="40000" dist="23000" dir="5400000" rotWithShape="0">
+              <a:srgbClr val="000000">
+                <a:alpha val="35000"/>
+              </a:srgbClr>
+            </a:outerShdw>
+          </a:effectLst>
+        </a:effectStyle>
+        <a:effectStyle>
+          <a:effectLst>
+            <a:outerShdw blurRad="40000" dist="23000" dir="5400000" rotWithShape="0">
+              <a:srgbClr val="000000">
+                <a:alpha val="35000"/>
+              </a:srgbClr>
+            </a:outerShdw>
+          </a:effectLst>
+          <a:scene3d>
+            <a:camera prst="orthographicFront">
+              <a:rot lat="0" lon="0" rev="0"/>
+            </a:camera>
+            <a:lightRig rig="threePt" dir="t">
+              <a:rot lat="0" lon="0" rev="1200000"/>
+            </a:lightRig>
+          </a:scene3d>
+          <a:sp3d>
+            <a:bevelT w="63500" h="25400"/>
+          </a:sp3d>
+        </a:effectStyle>
+      </a:effectStyleLst>
+      <a:bgFillStyleLst>
+        <a:solidFill>
+          <a:schemeClr val="phClr"/>
+        </a:solidFill>
+        <a:gradFill rotWithShape="1">
+          <a:gsLst>
+            <a:gs pos="0">
+              <a:schemeClr val="phClr">
+                <a:tint val="40000"/>
+                <a:satMod val="350000"/>
+              </a:schemeClr>
+            </a:gs>
+            <a:gs pos="40000">
+              <a:schemeClr val="phClr">
+                <a:tint val="45000"/>
+                <a:satMod val="350000"/>
+                <a:shade val="99000"/>
+              </a:schemeClr>
+            </a:gs>
+            <a:gs pos="100000">
+              <a:schemeClr val="phClr">
+                <a:shade val="20000"/>
+                <a:satMod val="255000"/>
+              </a:schemeClr>
+            </a:gs>
+          </a:gsLst>
+          <a:path path="circle">
+            <a:fillToRect l="50000" t="-80000" r="50000" b="180000"/>
+          </a:path>
+        </a:gradFill>
+        <a:gradFill rotWithShape="1">
+          <a:gsLst>
+            <a:gs pos="0">
+              <a:schemeClr val="phClr">
+                <a:tint val="80000"/>
+                <a:satMod val="300000"/>
+              </a:schemeClr>
+            </a:gs>
+            <a:gs pos="100000">
+              <a:schemeClr val="phClr">
+                <a:shade val="30000"/>
+                <a:satMod val="200000"/>
+              </a:schemeClr>
+            </a:gs>
+          </a:gsLst>
+          <a:path path="circle">
+            <a:fillToRect l="50000" t="50000" r="50000" b="50000"/>
+          </a:path>
+        </a:gradFill>
+      </a:bgFillStyleLst>
+    </a:fmtScheme>
+  </a:themeElements>
+  <a:objectDefaults/>
+</a:theme>
 </file>
</xml_diff>